<commit_message>
1.0.7 (chưa phát hành): mẫu T13 biên bản bốc thăm lô TĐC; mục DT thu hồi theo tình trạng pháp lý nguồn gốc đất trong R1, R2; tính nền lần mở đầu với dữ liệu lớn (20.000 hộ: Tổng quan 9,7 s → 2,6 s); tài liệu
Co-Authored-By: Claude Opus 5.5 <noreply@anthropic.com>
Claude-Session: https://claude.ai/code/session_01BZcswa4gE3voAhFCMjfJc5
</commit_message>
<xml_diff>
--- a/apps/desktop/public/mau-van-ban/rieng-bao-cao-tham-dinh.docx
+++ b/apps/desktop/public/mau-van-ban/rieng-bao-cao-tham-dinh.docx
@@ -1061,6 +1061,132 @@
       <w:pPr>
         <w:pStyle w:val="Normal"/>
         <w:spacing w:before="60" w:after="0"/>
+        <w:ind w:firstLine="709" w:end="0"/>
+        <w:jc w:val="both"/>
+        <w:rPr>
+          <w:spacing w:val="2"/>
+          <w:sz w:val="28"/>
+          <w:szCs w:val="28"/>
+        </w:rPr>
+      </w:pPr>
+      <w:r>
+        <w:rPr>
+          <w:spacing w:val="2"/>
+          <w:sz w:val="28"/>
+          <w:szCs w:val="28"/>
+        </w:rPr>
+        <w:t xml:space="preserve">{#co_phap_ly}</w:t>
+      </w:r>
+    </w:p>
+    <w:p>
+      <w:pPr>
+        <w:pStyle w:val="Normal"/>
+        <w:spacing w:before="60" w:after="0"/>
+        <w:ind w:firstLine="709" w:end="0"/>
+        <w:jc w:val="both"/>
+        <w:rPr>
+          <w:spacing w:val="2"/>
+          <w:sz w:val="28"/>
+          <w:szCs w:val="28"/>
+        </w:rPr>
+      </w:pPr>
+      <w:r>
+        <w:rPr>
+          <w:spacing w:val="2"/>
+          <w:sz w:val="28"/>
+          <w:szCs w:val="28"/>
+        </w:rPr>
+        <w:t xml:space="preserve">* Phân theo tình trạng pháp lý nguồn gốc đất (theo hồ sơ thửa đất):</w:t>
+      </w:r>
+    </w:p>
+    <w:p>
+      <w:pPr>
+        <w:pStyle w:val="Normal"/>
+        <w:spacing w:before="60" w:after="0"/>
+        <w:ind w:firstLine="709" w:end="0"/>
+        <w:jc w:val="both"/>
+        <w:rPr>
+          <w:spacing w:val="2"/>
+          <w:sz w:val="28"/>
+          <w:szCs w:val="28"/>
+        </w:rPr>
+      </w:pPr>
+      <w:r>
+        <w:rPr>
+          <w:spacing w:val="2"/>
+          <w:sz w:val="28"/>
+          <w:szCs w:val="28"/>
+        </w:rPr>
+        <w:t xml:space="preserve">{#dt_theo_phap_ly}</w:t>
+      </w:r>
+    </w:p>
+    <w:p>
+      <w:pPr>
+        <w:pStyle w:val="Normal"/>
+        <w:spacing w:before="60" w:after="0"/>
+        <w:ind w:firstLine="709" w:end="0"/>
+        <w:jc w:val="both"/>
+        <w:rPr>
+          <w:spacing w:val="2"/>
+          <w:sz w:val="28"/>
+          <w:szCs w:val="28"/>
+        </w:rPr>
+      </w:pPr>
+      <w:r>
+        <w:rPr>
+          <w:spacing w:val="2"/>
+          <w:sz w:val="28"/>
+          <w:szCs w:val="28"/>
+        </w:rPr>
+        <w:t xml:space="preserve">+ {ten}: {so_thua} thửa, {dien_tich} m2.</w:t>
+      </w:r>
+    </w:p>
+    <w:p>
+      <w:pPr>
+        <w:pStyle w:val="Normal"/>
+        <w:spacing w:before="60" w:after="0"/>
+        <w:ind w:firstLine="709" w:end="0"/>
+        <w:jc w:val="both"/>
+        <w:rPr>
+          <w:spacing w:val="2"/>
+          <w:sz w:val="28"/>
+          <w:szCs w:val="28"/>
+        </w:rPr>
+      </w:pPr>
+      <w:r>
+        <w:rPr>
+          <w:spacing w:val="2"/>
+          <w:sz w:val="28"/>
+          <w:szCs w:val="28"/>
+        </w:rPr>
+        <w:t xml:space="preserve">{/dt_theo_phap_ly}</w:t>
+      </w:r>
+    </w:p>
+    <w:p>
+      <w:pPr>
+        <w:pStyle w:val="Normal"/>
+        <w:spacing w:before="60" w:after="0"/>
+        <w:ind w:firstLine="709" w:end="0"/>
+        <w:jc w:val="both"/>
+        <w:rPr>
+          <w:spacing w:val="2"/>
+          <w:sz w:val="28"/>
+          <w:szCs w:val="28"/>
+        </w:rPr>
+      </w:pPr>
+      <w:r>
+        <w:rPr>
+          <w:spacing w:val="2"/>
+          <w:sz w:val="28"/>
+          <w:szCs w:val="28"/>
+        </w:rPr>
+        <w:t xml:space="preserve">{/co_phap_ly}</w:t>
+      </w:r>
+    </w:p>
+    <w:p>
+      <w:pPr>
+        <w:pStyle w:val="Normal"/>
+        <w:spacing w:before="60" w:after="0"/>
         <w:ind w:start="709" w:end="0"/>
         <w:jc w:val="both"/>
         <w:rPr>

</xml_diff>

<commit_message>
1.1.0 (D2): rà thể thức 54 mẫu Word theo NĐ 30/2020 (khổ, lề, phông, cỡ chữ) — kiểm thử tự động; in thử bằng LibreOffice; 5 mẫu riêng của địa phương đổi phông còn sót (.VnTime, Liberation Serif, Calibri) sang Times New Roman
Co-Authored-By: Claude Opus 5.5 <noreply@anthropic.com>
Claude-Session: https://claude.ai/code/session_01BZcswa4gE3voAhFCMjfJc5
</commit_message>
<xml_diff>
--- a/apps/desktop/public/mau-van-ban/rieng-bao-cao-tham-dinh.docx
+++ b/apps/desktop/public/mau-van-ban/rieng-bao-cao-tham-dinh.docx
@@ -221,7 +221,7 @@
                       <w:sz w:val="8"/>
                       <w:szCs w:val="28"/>
                       <w:vertAlign w:val="superscript"/>
-                      <w:lang w:val="en-US" w:eastAsia="en-US"/>
+                      <w:lang w:val="en-US" w:eastAsia="Times New Roman"/>
                     </w:rPr>
                   </w:pPr>
                   <w:r>
@@ -231,7 +231,7 @@
                       <w:sz w:val="8"/>
                       <w:szCs w:val="28"/>
                       <w:vertAlign w:val="superscript"/>
-                      <w:lang w:val="en-US" w:eastAsia="en-US"/>
+                      <w:lang w:val="en-US" w:eastAsia="Times New Roman"/>
                     </w:rPr>
                     <mc:AlternateContent>
                       <mc:Choice Requires="wps">
@@ -2157,10 +2157,10 @@
   <w:docDefaults>
     <w:rPrDefault>
       <w:rPr>
-        <w:rFonts w:ascii="Liberation Serif" w:hAnsi="Liberation Serif" w:eastAsia="WenQuanYi Zen Hei" w:cs="FreeSans"/>
+        <w:rFonts w:ascii="Times New Roman" w:hAnsi="Times New Roman" w:eastAsia="Times New Roman" w:cs="Times New Roman"/>
         <w:sz w:val="24"/>
         <w:szCs w:val="24"/>
-        <w:lang w:val="en-US" w:eastAsia="zh-CN" w:bidi="hi-IN"/>
+        <w:lang w:val="en-US" w:eastAsia="Times New Roman" w:bidi="hi-IN"/>
       </w:rPr>
     </w:rPrDefault>
     <w:pPrDefault>
@@ -2181,7 +2181,7 @@
       <w:color w:val="auto"/>
       <w:sz w:val="24"/>
       <w:szCs w:val="24"/>
-      <w:lang w:val="en-US" w:bidi="ar-SA" w:eastAsia="zh-CN"/>
+      <w:lang w:val="en-US" w:bidi="ar-SA" w:eastAsia="Times New Roman"/>
     </w:rPr>
   </w:style>
   <w:style w:type="paragraph" w:styleId="Heading1">
@@ -2200,7 +2200,7 @@
       <w:outlineLvl w:val="0"/>
     </w:pPr>
     <w:rPr>
-      <w:rFonts w:ascii=".VnTimeH;Courier New" w:hAnsi=".VnTimeH;Courier New" w:cs=".VnTimeH;Courier New"/>
+      <w:rFonts w:ascii="Times New Roman" w:hAnsi="Times New Roman" w:cs="Times New Roman"/>
       <w:b/>
       <w:sz w:val="36"/>
       <w:szCs w:val="20"/>
@@ -2222,7 +2222,7 @@
       <w:outlineLvl w:val="1"/>
     </w:pPr>
     <w:rPr>
-      <w:rFonts w:ascii=".VnTime;Courier New" w:hAnsi=".VnTime;Courier New" w:cs=".VnTime;Courier New"/>
+      <w:rFonts w:ascii="Times New Roman" w:hAnsi="Times New Roman" w:cs="Times New Roman"/>
       <w:b/>
       <w:sz w:val="28"/>
       <w:szCs w:val="20"/>
@@ -2260,7 +2260,7 @@
     <w:name w:val="WW8Num1z1"/>
     <w:qFormat/>
     <w:rPr>
-      <w:rFonts w:ascii="Courier New" w:hAnsi="Courier New" w:cs="Courier New"/>
+      <w:rFonts w:ascii="Times New Roman" w:hAnsi="Times New Roman" w:cs="Times New Roman"/>
     </w:rPr>
   </w:style>
   <w:style w:type="character" w:styleId="WW8Num1z2">
@@ -2298,7 +2298,7 @@
     <w:name w:val="Body Text Indent Char"/>
     <w:qFormat/>
     <w:rPr>
-      <w:rFonts w:ascii=".VnTime;Courier New" w:hAnsi=".VnTime;Courier New" w:cs=".VnTime;Courier New"/>
+      <w:rFonts w:ascii="Times New Roman" w:hAnsi="Times New Roman" w:cs="Times New Roman"/>
       <w:sz w:val="28"/>
       <w:lang w:val="en-US" w:bidi="ar-SA"/>
     </w:rPr>
@@ -2371,7 +2371,7 @@
       <w:spacing w:before="240" w:after="120"/>
     </w:pPr>
     <w:rPr>
-      <w:rFonts w:ascii="Liberation Sans" w:hAnsi="Liberation Sans" w:eastAsia="WenQuanYi Zen Hei" w:cs="FreeSans"/>
+      <w:rFonts w:ascii="Times New Roman" w:hAnsi="Times New Roman" w:eastAsia="Times New Roman" w:cs="Times New Roman"/>
       <w:sz w:val="28"/>
       <w:szCs w:val="28"/>
     </w:rPr>
@@ -2389,7 +2389,7 @@
     <w:basedOn w:val="BodyText"/>
     <w:pPr/>
     <w:rPr>
-      <w:rFonts w:cs="FreeSans"/>
+      <w:rFonts w:cs="Times New Roman"/>
     </w:rPr>
   </w:style>
   <w:style w:type="paragraph" w:styleId="Caption">
@@ -2401,7 +2401,7 @@
       <w:spacing w:before="120" w:after="120"/>
     </w:pPr>
     <w:rPr>
-      <w:rFonts w:cs="FreeSans"/>
+      <w:rFonts w:cs="Times New Roman"/>
       <w:i/>
       <w:iCs/>
       <w:sz w:val="24"/>
@@ -2416,7 +2416,7 @@
       <w:suppressLineNumbers/>
     </w:pPr>
     <w:rPr>
-      <w:rFonts w:cs="FreeSans"/>
+      <w:rFonts w:cs="Times New Roman"/>
     </w:rPr>
   </w:style>
   <w:style w:type="paragraph" w:styleId="BodyText2">
@@ -2428,7 +2428,7 @@
       <w:jc w:val="both"/>
     </w:pPr>
     <w:rPr>
-      <w:rFonts w:ascii=".VnTime;Courier New" w:hAnsi=".VnTime;Courier New" w:cs=".VnTime;Courier New"/>
+      <w:rFonts w:ascii="Times New Roman" w:hAnsi="Times New Roman" w:cs="Times New Roman"/>
       <w:sz w:val="28"/>
       <w:lang w:val="fr-FR"/>
     </w:rPr>
@@ -2468,7 +2468,7 @@
       <w:jc w:val="both"/>
     </w:pPr>
     <w:rPr>
-      <w:rFonts w:ascii=".VnTime;Courier New" w:hAnsi=".VnTime;Courier New" w:cs=".VnTime;Courier New"/>
+      <w:rFonts w:ascii="Times New Roman" w:hAnsi="Times New Roman" w:cs="Times New Roman"/>
       <w:sz w:val="28"/>
       <w:szCs w:val="20"/>
     </w:rPr>
@@ -2493,7 +2493,7 @@
       <w:shd w:fill="000080" w:val="clear"/>
     </w:pPr>
     <w:rPr>
-      <w:rFonts w:ascii="Tahoma" w:hAnsi="Tahoma" w:cs="Tahoma"/>
+      <w:rFonts w:ascii="Times New Roman" w:hAnsi="Times New Roman" w:cs="Times New Roman"/>
       <w:sz w:val="20"/>
       <w:szCs w:val="20"/>
     </w:rPr>
@@ -2507,11 +2507,11 @@
       <w:jc w:val="both"/>
     </w:pPr>
     <w:rPr>
-      <w:rFonts w:eastAsia="SimSun;宋体" w:cs="Times New Roman"/>
+      <w:rFonts w:eastAsia="Times New Roman" w:cs="Times New Roman"/>
       <w:kern w:val="2"/>
       <w:sz w:val="24"/>
       <w:szCs w:val="24"/>
-      <w:lang w:eastAsia="zh-CN"/>
+      <w:lang w:eastAsia="Times New Roman"/>
     </w:rPr>
   </w:style>
   <w:style w:type="paragraph" w:styleId="Char">
@@ -2523,11 +2523,11 @@
       <w:jc w:val="both"/>
     </w:pPr>
     <w:rPr>
-      <w:rFonts w:eastAsia="SimSun;宋体" w:cs="Times New Roman"/>
+      <w:rFonts w:eastAsia="Times New Roman" w:cs="Times New Roman"/>
       <w:kern w:val="2"/>
       <w:sz w:val="24"/>
       <w:szCs w:val="24"/>
-      <w:lang w:eastAsia="zh-CN"/>
+      <w:lang w:eastAsia="Times New Roman"/>
     </w:rPr>
   </w:style>
   <w:style w:type="paragraph" w:styleId="NormalWeb">

</xml_diff>